<commit_message>
Add dose profile analyzer and update resume
</commit_message>
<xml_diff>
--- a/resume/Ivan_Zelenin_IT_resume.docx
+++ b/resume/Ivan_Zelenin_IT_resume.docx
@@ -80,10 +80,7 @@
     </w:p>
     <w:p>
       <w:r>
-        <w:rPr>
-          <w:rFonts w:ascii="Arial" w:hAnsi="Arial" w:eastAsia="Arial"/>
-        </w:rPr>
-        <w:t>Студент ННГУ им. Н. И. Лобачевского по направлению «Фундаментальная информатика и информационные технологии». Ищу стажировку или Junior-позицию в Python-разработке или анализе данных. Использую Python и SQL в учебных и прикладных проектах по анализу данных, научным вычислениям, обработке изображений и автоматизации. Особенно интересны задачи, связанные с данными и инженерными расчётами.</w:t>
+        <w:t>Студент ННГУ им. Н. И. Лобачевского по направлению «Фундаментальная информатика и информационные технологии». Ищу стажировку или Junior-позицию в Python-разработке или анализе данных. Использую Python и SQL в проектах по анализу данных, научным вычислениям, обработке изображений и автоматизации.</w:t>
       </w:r>
     </w:p>
     <w:p>
@@ -103,55 +100,39 @@
     <w:p>
       <w:r>
         <w:rPr>
-          <w:rFonts w:ascii="Arial" w:hAnsi="Arial" w:eastAsia="Arial"/>
           <w:b/>
         </w:rPr>
         <w:t xml:space="preserve">Python: </w:t>
       </w:r>
       <w:r>
-        <w:rPr>
-          <w:rFonts w:ascii="Arial" w:hAnsi="Arial" w:eastAsia="Arial"/>
-        </w:rPr>
-        <w:t xml:space="preserve">файлы, CSV, JSON, argparse, requests, структуры данных, алгоритмы, pytest.  </w:t>
+        <w:t xml:space="preserve">файлы, CSV, JSON, argparse, requests, алгоритмы, pytest.  </w:t>
       </w:r>
       <w:r>
         <w:rPr>
-          <w:rFonts w:ascii="Arial" w:hAnsi="Arial" w:eastAsia="Arial"/>
           <w:b/>
         </w:rPr>
         <w:t xml:space="preserve">Data: </w:t>
       </w:r>
       <w:r>
-        <w:rPr>
-          <w:rFonts w:ascii="Arial" w:hAnsi="Arial" w:eastAsia="Arial"/>
-        </w:rPr>
-        <w:t xml:space="preserve">pandas, NumPy, SciPy, matplotlib, Pillow, очистка данных, агрегация, визуализация.  </w:t>
+        <w:t xml:space="preserve">pandas, NumPy, SciPy, matplotlib, Pillow, OpenPyXL, обработка данных и изображений, численные методы.  </w:t>
       </w:r>
       <w:r>
         <w:rPr>
-          <w:rFonts w:ascii="Arial" w:hAnsi="Arial" w:eastAsia="Arial"/>
           <w:b/>
         </w:rPr>
         <w:t xml:space="preserve">SQL: </w:t>
       </w:r>
       <w:r>
-        <w:rPr>
-          <w:rFonts w:ascii="Arial" w:hAnsi="Arial" w:eastAsia="Arial"/>
-        </w:rPr>
         <w:t xml:space="preserve">SELECT, WHERE, GROUP BY, CASE, JOIN, подзапросы, MySQL, SQLite.  </w:t>
       </w:r>
       <w:r>
         <w:rPr>
-          <w:rFonts w:ascii="Arial" w:hAnsi="Arial" w:eastAsia="Arial"/>
           <w:b/>
         </w:rPr>
         <w:t xml:space="preserve">Инструменты: </w:t>
       </w:r>
       <w:r>
-        <w:rPr>
-          <w:rFonts w:ascii="Arial" w:hAnsi="Arial" w:eastAsia="Arial"/>
-        </w:rPr>
-        <w:t>Git, GitHub, VS Code, Jupyter Notebook, MATLAB; Flask/Jinja2 - базовый опыт.</w:t>
+        <w:t>Git, GitHub, VS Code, Jupyter Notebook, MATLAB; базовый опыт Flask/Jinja2.</w:t>
       </w:r>
     </w:p>
     <w:p>
@@ -192,14 +173,12 @@
       </w:pPr>
       <w:r>
         <w:rPr>
-          <w:rFonts w:ascii="Arial" w:hAnsi="Arial" w:eastAsia="Arial"/>
           <w:b/>
         </w:rPr>
         <w:t>SEM Image Analysis</w:t>
       </w:r>
       <w:r>
         <w:rPr>
-          <w:rFonts w:ascii="Arial" w:hAnsi="Arial" w:eastAsia="Arial"/>
           <w:i/>
         </w:rPr>
         <w:t xml:space="preserve">  |  Python, NumPy, SciPy, Pillow, matplotlib, MATLAB</w:t>
@@ -207,20 +186,16 @@
     </w:p>
     <w:p>
       <w:pPr>
-        <w:spacing w:after="20"/>
+        <w:spacing w:after="0" w:line="235" w:lineRule="auto"/>
       </w:pPr>
       <w:r>
-        <w:rPr>
-          <w:rFonts w:ascii="Arial" w:hAnsi="Arial" w:eastAsia="Arial"/>
-        </w:rPr>
-        <w:t xml:space="preserve">Анализ реальных SEM/TIF-изображений фоторезиста: предварительная обработка, оценка масштаба, выделение краёв линий, расчёт CD/LER/LWR, экспорт результатов в CSV и диагностические графики. </w:t>
+        <w:t xml:space="preserve">Анализ реальных SEM/TIF-изображений фоторезиста: обработка, оценка масштаба, выделение краёв и расчёт CD/LER/LWR; CSV и графики. </w:t>
       </w:r>
       <w:hyperlink r:id="rId11">
         <w:r>
           <w:rPr>
-            <w:color w:val="1F4E79"/>
-            <w:rFonts w:ascii="Arial" w:hAnsi="Arial"/>
-            <w:sz w:val="19"/>
+            <w:color w:val="0563C1"/>
+            <w:u w:val="single"/>
           </w:rPr>
           <w:t>GitHub</w:t>
         </w:r>
@@ -232,14 +207,46 @@
       </w:pPr>
       <w:r>
         <w:rPr>
-          <w:rFonts w:ascii="Arial" w:hAnsi="Arial" w:eastAsia="Arial"/>
+          <w:b/>
+        </w:rPr>
+        <w:t>Dose Profile Analyzer</w:t>
+      </w:r>
+      <w:r>
+        <w:rPr>
+          <w:i/>
+        </w:rPr>
+        <w:t xml:space="preserve">  |  Python, NumPy, SciPy, matplotlib, OpenPyXL, pytest</w:t>
+      </w:r>
+    </w:p>
+    <w:p>
+      <w:pPr>
+        <w:spacing w:after="0" w:line="235" w:lineRule="auto"/>
+      </w:pPr>
+      <w:r>
+        <w:t xml:space="preserve">Автоматический анализ профилей профилометрии: поиск периодической сетки, расчёт глубины относительно локальной поверхности, контроль качества, дозовые кривые и HTML-отчёт. </w:t>
+      </w:r>
+      <w:hyperlink r:id="rId20">
+        <w:r>
+          <w:rPr>
+            <w:color w:val="0563C1"/>
+            <w:u w:val="single"/>
+          </w:rPr>
+          <w:t>GitHub</w:t>
+        </w:r>
+      </w:hyperlink>
+    </w:p>
+    <w:p>
+      <w:pPr>
+        <w:pStyle w:val="Heading2"/>
+      </w:pPr>
+      <w:r>
+        <w:rPr>
           <w:b/>
         </w:rPr>
         <w:t>Student Performance Analysis</w:t>
       </w:r>
       <w:r>
         <w:rPr>
-          <w:rFonts w:ascii="Arial" w:hAnsi="Arial" w:eastAsia="Arial"/>
           <w:i/>
         </w:rPr>
         <w:t xml:space="preserve">  |  Python, pandas, matplotlib</w:t>
@@ -272,14 +279,12 @@
       </w:pPr>
       <w:r>
         <w:rPr>
-          <w:rFonts w:ascii="Arial" w:hAnsi="Arial" w:eastAsia="Arial"/>
           <w:b/>
         </w:rPr>
         <w:t>SQL Airline Queries</w:t>
       </w:r>
       <w:r>
         <w:rPr>
-          <w:rFonts w:ascii="Arial" w:hAnsi="Arial" w:eastAsia="Arial"/>
           <w:i/>
         </w:rPr>
         <w:t xml:space="preserve">  |  SQL</w:t>
@@ -287,20 +292,16 @@
     </w:p>
     <w:p>
       <w:pPr>
-        <w:spacing w:after="20"/>
+        <w:spacing w:after="0" w:line="235" w:lineRule="auto"/>
       </w:pPr>
       <w:r>
-        <w:rPr>
-          <w:rFonts w:ascii="Arial" w:hAnsi="Arial" w:eastAsia="Arial"/>
-        </w:rPr>
-        <w:t xml:space="preserve">70 запросов к учебным данным авиаперевозок: фильтрация, сортировка, CASE, агрегаты, JOIN, подзапросы и обработка NULL. </w:t>
+        <w:t xml:space="preserve">70 SQL-запросов: фильтрация, CASE, агрегаты, JOIN, подзапросы и NULL. </w:t>
       </w:r>
       <w:hyperlink r:id="rId13">
         <w:r>
           <w:rPr>
-            <w:color w:val="1F4E79"/>
-            <w:rFonts w:ascii="Arial" w:hAnsi="Arial"/>
-            <w:sz w:val="19"/>
+            <w:color w:val="0563C1"/>
+            <w:u w:val="single"/>
           </w:rPr>
           <w:t>GitHub</w:t>
         </w:r>
@@ -312,14 +313,12 @@
       </w:pPr>
       <w:r>
         <w:rPr>
-          <w:rFonts w:ascii="Arial" w:hAnsi="Arial" w:eastAsia="Arial"/>
           <w:b/>
         </w:rPr>
         <w:t>API Data Parser</w:t>
       </w:r>
       <w:r>
         <w:rPr>
-          <w:rFonts w:ascii="Arial" w:hAnsi="Arial" w:eastAsia="Arial"/>
           <w:i/>
         </w:rPr>
         <w:t xml:space="preserve">  |  Python, requests, JSON, CSV, argparse</w:t>
@@ -327,20 +326,16 @@
     </w:p>
     <w:p>
       <w:pPr>
-        <w:spacing w:after="20"/>
+        <w:spacing w:after="0" w:line="235" w:lineRule="auto"/>
       </w:pPr>
       <w:r>
-        <w:rPr>
-          <w:rFonts w:ascii="Arial" w:hAnsi="Arial" w:eastAsia="Arial"/>
-        </w:rPr>
-        <w:t xml:space="preserve">CLI-программа для загрузки JSON из файла или HTTP API, нормализации записей, фильтрации и экспорта результата в CSV. </w:t>
+        <w:t xml:space="preserve">CLI для загрузки JSON из файла/API, нормализации, фильтрации и экспорта в CSV. </w:t>
       </w:r>
       <w:hyperlink r:id="rId14">
         <w:r>
           <w:rPr>
-            <w:color w:val="1F4E79"/>
-            <w:rFonts w:ascii="Arial" w:hAnsi="Arial"/>
-            <w:sz w:val="19"/>
+            <w:color w:val="0563C1"/>
+            <w:u w:val="single"/>
           </w:rPr>
           <w:t>GitHub</w:t>
         </w:r>
@@ -352,14 +347,12 @@
       </w:pPr>
       <w:r>
         <w:rPr>
-          <w:rFonts w:ascii="Arial" w:hAnsi="Arial" w:eastAsia="Arial"/>
           <w:b/>
         </w:rPr>
         <w:t>Maze Pathfinding</w:t>
       </w:r>
       <w:r>
         <w:rPr>
-          <w:rFonts w:ascii="Arial" w:hAnsi="Arial" w:eastAsia="Arial"/>
           <w:i/>
         </w:rPr>
         <w:t xml:space="preserve">  |  Python, BFS, A*, pytest</w:t>
@@ -367,20 +360,16 @@
     </w:p>
     <w:p>
       <w:pPr>
-        <w:spacing w:after="20"/>
+        <w:spacing w:after="0" w:line="235" w:lineRule="auto"/>
       </w:pPr>
       <w:r>
-        <w:rPr>
-          <w:rFonts w:ascii="Arial" w:hAnsi="Arial" w:eastAsia="Arial"/>
-        </w:rPr>
-        <w:t xml:space="preserve">Поиск пути в текстовом лабиринте: BFS от старта до ключа и A* от ключа до выхода. </w:t>
+        <w:t xml:space="preserve">Поиск пути в лабиринте: BFS от старта до ключа и A* до выхода. </w:t>
       </w:r>
       <w:hyperlink r:id="rId15">
         <w:r>
           <w:rPr>
-            <w:color w:val="1F4E79"/>
-            <w:rFonts w:ascii="Arial" w:hAnsi="Arial"/>
-            <w:sz w:val="19"/>
+            <w:color w:val="0563C1"/>
+            <w:u w:val="single"/>
           </w:rPr>
           <w:t>GitHub</w:t>
         </w:r>

</xml_diff>